<commit_message>
update the product applications and a new manufacturer
</commit_message>
<xml_diff>
--- a/public/static/websites/product_information_update_template.docx
+++ b/public/static/websites/product_information_update_template.docx
@@ -24,11 +24,6 @@
       </w:r>
     </w:p>
     <w:p>
-      <w:pPr>
-        <w:rPr>
-          <w:rFonts w:hint="eastAsia"/>
-        </w:rPr>
-      </w:pPr>
       <w:proofErr w:type="spellStart"/>
       <w:r>
         <w:rPr>
@@ -1455,6 +1450,110 @@
           </w:p>
         </w:tc>
       </w:tr>
+      <w:tr>
+        <w:tc>
+          <w:tcPr>
+            <w:tcW w:w="3672" w:type="dxa"/>
+          </w:tcPr>
+          <w:p>
+            <w:pPr>
+              <w:spacing w:after="60"/>
+              <w:rPr>
+                <w:b/>
+                <w:color w:val="0B2545"/>
+                <w:sz w:val="20"/>
+                <w:lang w:eastAsia="zh-CN"/>
+              </w:rPr>
+            </w:pPr>
+            <w:r>
+              <w:rPr>
+                <w:rFonts w:hint="eastAsia"/>
+                <w:b/>
+                <w:color w:val="0B2545"/>
+                <w:sz w:val="20"/>
+                <w:lang w:eastAsia="zh-CN"/>
+              </w:rPr>
+              <w:t>产品应用案例（可选，可填写多个）</w:t>
+            </w:r>
+          </w:p>
+          <w:p>
+            <w:pPr>
+              <w:spacing w:after="60"/>
+              <w:rPr>
+                <w:b/>
+                <w:color w:val="0B2545"/>
+                <w:sz w:val="20"/>
+                <w:lang w:eastAsia="zh-CN"/>
+              </w:rPr>
+            </w:pPr>
+            <w:r>
+              <w:rPr>
+                <w:rFonts w:hint="eastAsia"/>
+                <w:b/>
+                <w:color w:val="0B2545"/>
+                <w:sz w:val="20"/>
+                <w:lang w:eastAsia="zh-CN"/>
+              </w:rPr>
+              <w:t>每个应用案例建议包含：应用名称、完整描述、优势或对比、应用领域。如有对应图片，请填写文件名，并放入</w:t>
+            </w:r>
+            <w:r>
+              <w:rPr>
+                <w:rFonts w:hint="eastAsia"/>
+                <w:b/>
+                <w:color w:val="0B2545"/>
+                <w:sz w:val="20"/>
+                <w:lang w:eastAsia="zh-CN"/>
+              </w:rPr>
+              <w:t xml:space="preserve"> </w:t>
+            </w:r>
+            <w:proofErr w:type="spellStart"/>
+            <w:r>
+              <w:rPr>
+                <w:rFonts w:hint="eastAsia"/>
+                <w:b/>
+                <w:color w:val="0B2545"/>
+                <w:sz w:val="20"/>
+                <w:lang w:eastAsia="zh-CN"/>
+              </w:rPr>
+              <w:t>product_applications</w:t>
+            </w:r>
+            <w:proofErr w:type="spellEnd"/>
+            <w:r>
+              <w:rPr>
+                <w:rFonts w:hint="eastAsia"/>
+                <w:b/>
+                <w:color w:val="0B2545"/>
+                <w:sz w:val="20"/>
+                <w:lang w:eastAsia="zh-CN"/>
+              </w:rPr>
+              <w:t xml:space="preserve"> </w:t>
+            </w:r>
+            <w:r>
+              <w:rPr>
+                <w:rFonts w:hint="eastAsia"/>
+                <w:b/>
+                <w:color w:val="0B2545"/>
+                <w:sz w:val="20"/>
+                <w:lang w:eastAsia="zh-CN"/>
+              </w:rPr>
+              <w:t>文件夹。</w:t>
+            </w:r>
+          </w:p>
+        </w:tc>
+        <w:tc>
+          <w:tcPr>
+            <w:tcW w:w="5688" w:type="dxa"/>
+          </w:tcPr>
+          <w:p>
+            <w:pPr>
+              <w:spacing w:after="200"/>
+              <w:rPr>
+                <w:lang w:eastAsia="zh-CN"/>
+              </w:rPr>
+            </w:pPr>
+          </w:p>
+        </w:tc>
+      </w:tr>
     </w:tbl>
     <w:p>
       <w:pPr>
@@ -1477,7 +1576,6 @@
         <w:pStyle w:val="1"/>
       </w:pPr>
       <w:r>
-        <w:lastRenderedPageBreak/>
         <w:t xml:space="preserve">3. </w:t>
       </w:r>
       <w:r>
@@ -2305,6 +2403,16 @@
         <w:t xml:space="preserve">    product_images/</w:t>
       </w:r>
     </w:p>
+    <w:p>
+      <w:proofErr w:type="spellStart"/>
+      <w:r>
+        <w:t>product_applications</w:t>
+      </w:r>
+      <w:proofErr w:type="spellEnd"/>
+      <w:r>
+        <w:t>/</w:t>
+      </w:r>
+    </w:p>
     <w:p/>
     <w:tbl>
       <w:tblPr>
@@ -2364,14 +2472,18 @@
           </w:tcPr>
           <w:p>
             <w:pPr>
-              <w:spacing w:after="60"/>
-              <w:rPr>
+              <w:spacing w:after="0" w:line="276" w:lineRule="auto"/>
+              <w:rPr>
+                <w:b/>
+                <w:color w:val="0B2545"/>
+                <w:sz w:val="20"/>
                 <w:lang w:eastAsia="zh-CN"/>
               </w:rPr>
             </w:pPr>
             <w:proofErr w:type="spellStart"/>
             <w:r>
               <w:rPr>
+                <w:rFonts w:hint="eastAsia"/>
                 <w:b/>
                 <w:color w:val="0B2545"/>
                 <w:sz w:val="20"/>
@@ -2382,6 +2494,7 @@
             <w:proofErr w:type="spellEnd"/>
             <w:r>
               <w:rPr>
+                <w:rFonts w:hint="eastAsia"/>
                 <w:b/>
                 <w:color w:val="0B2545"/>
                 <w:sz w:val="20"/>
@@ -2391,6 +2504,7 @@
             </w:r>
             <w:r>
               <w:rPr>
+                <w:rFonts w:hint="eastAsia"/>
                 <w:b/>
                 <w:color w:val="0B2545"/>
                 <w:sz w:val="20"/>
@@ -2406,41 +2520,15 @@
                 <w:lang w:eastAsia="zh-CN"/>
               </w:rPr>
             </w:pPr>
-            <w:proofErr w:type="gramStart"/>
             <w:r>
               <w:rPr>
-                <w:color w:val="555555"/>
-                <w:sz w:val="17"/>
-                <w:lang w:eastAsia="zh-CN"/>
-              </w:rPr>
-              <w:t>放产品</w:t>
-            </w:r>
-            <w:proofErr w:type="gramEnd"/>
-            <w:r>
-              <w:rPr>
-                <w:color w:val="555555"/>
-                <w:sz w:val="17"/>
-                <w:lang w:eastAsia="zh-CN"/>
-              </w:rPr>
-              <w:t>图、结构图、应用图。只提交方图或横图，图片宽度必须大于或等于高度；</w:t>
-            </w:r>
-            <w:proofErr w:type="gramStart"/>
-            <w:r>
-              <w:rPr>
-                <w:color w:val="555555"/>
-                <w:sz w:val="17"/>
-                <w:lang w:eastAsia="zh-CN"/>
-              </w:rPr>
-              <w:t>竖图不要</w:t>
-            </w:r>
-            <w:proofErr w:type="gramEnd"/>
-            <w:r>
-              <w:rPr>
-                <w:color w:val="555555"/>
-                <w:sz w:val="17"/>
-                <w:lang w:eastAsia="zh-CN"/>
-              </w:rPr>
-              <w:t>提交。</w:t>
+                <w:rFonts w:hint="eastAsia"/>
+                <w:b/>
+                <w:color w:val="0B2545"/>
+                <w:sz w:val="20"/>
+                <w:lang w:eastAsia="zh-CN"/>
+              </w:rPr>
+              <w:t>放产品图、结构图、细节图。只提交方图或横图，图片宽度必须大于或等于高度；竖图不要提交。</w:t>
             </w:r>
           </w:p>
         </w:tc>
@@ -2461,6 +2549,7 @@
                 <w:color w:val="0B2545"/>
                 <w:sz w:val="20"/>
               </w:rPr>
+              <w:lastRenderedPageBreak/>
               <w:t>product_certifications</w:t>
             </w:r>
             <w:proofErr w:type="spellEnd"/>
@@ -2531,7 +2620,6 @@
                 <w:sz w:val="20"/>
                 <w:lang w:eastAsia="zh-CN"/>
               </w:rPr>
-              <w:lastRenderedPageBreak/>
               <w:t>product_docs</w:t>
             </w:r>
             <w:proofErr w:type="spellEnd"/>
@@ -2561,23 +2649,13 @@
                 <w:lang w:eastAsia="zh-CN"/>
               </w:rPr>
             </w:pPr>
-            <w:proofErr w:type="gramStart"/>
             <w:r>
               <w:rPr>
                 <w:color w:val="555555"/>
                 <w:sz w:val="17"/>
                 <w:lang w:eastAsia="zh-CN"/>
               </w:rPr>
-              <w:t>放产品</w:t>
-            </w:r>
-            <w:proofErr w:type="gramEnd"/>
-            <w:r>
-              <w:rPr>
-                <w:color w:val="555555"/>
-                <w:sz w:val="17"/>
-                <w:lang w:eastAsia="zh-CN"/>
-              </w:rPr>
-              <w:t>手册、规格书、样本、说明书。只接受</w:t>
+              <w:t>放产品手册、规格书、样本、说明书。只接受</w:t>
             </w:r>
             <w:r>
               <w:rPr>
@@ -2625,25 +2703,7 @@
                 <w:sz w:val="17"/>
                 <w:lang w:eastAsia="zh-CN"/>
               </w:rPr>
-              <w:t>，</w:t>
-            </w:r>
-            <w:proofErr w:type="gramStart"/>
-            <w:r>
-              <w:rPr>
-                <w:color w:val="555555"/>
-                <w:sz w:val="17"/>
-                <w:lang w:eastAsia="zh-CN"/>
-              </w:rPr>
-              <w:t>单文件</w:t>
-            </w:r>
-            <w:proofErr w:type="gramEnd"/>
-            <w:r>
-              <w:rPr>
-                <w:color w:val="555555"/>
-                <w:sz w:val="17"/>
-                <w:lang w:eastAsia="zh-CN"/>
-              </w:rPr>
-              <w:t>小于</w:t>
+              <w:t>，单文件小于</w:t>
             </w:r>
             <w:r>
               <w:rPr>
@@ -2660,6 +2720,77 @@
                 <w:lang w:eastAsia="zh-CN"/>
               </w:rPr>
               <w:t>；必须说明对应产品。</w:t>
+            </w:r>
+          </w:p>
+        </w:tc>
+      </w:tr>
+      <w:tr>
+        <w:tc>
+          <w:tcPr>
+            <w:tcW w:w="9416" w:type="dxa"/>
+          </w:tcPr>
+          <w:p>
+            <w:pPr>
+              <w:spacing w:after="60"/>
+              <w:rPr>
+                <w:b/>
+                <w:color w:val="0B2545"/>
+                <w:sz w:val="20"/>
+                <w:lang w:eastAsia="zh-CN"/>
+              </w:rPr>
+            </w:pPr>
+            <w:proofErr w:type="spellStart"/>
+            <w:r>
+              <w:rPr>
+                <w:rFonts w:hint="eastAsia"/>
+                <w:b/>
+                <w:color w:val="0B2545"/>
+                <w:sz w:val="20"/>
+                <w:lang w:eastAsia="zh-CN"/>
+              </w:rPr>
+              <w:t>product_applications</w:t>
+            </w:r>
+            <w:proofErr w:type="spellEnd"/>
+            <w:r>
+              <w:rPr>
+                <w:rFonts w:hint="eastAsia"/>
+                <w:b/>
+                <w:color w:val="0B2545"/>
+                <w:sz w:val="20"/>
+                <w:lang w:eastAsia="zh-CN"/>
+              </w:rPr>
+              <w:t xml:space="preserve"> </w:t>
+            </w:r>
+            <w:r>
+              <w:rPr>
+                <w:rFonts w:hint="eastAsia"/>
+                <w:b/>
+                <w:color w:val="0B2545"/>
+                <w:sz w:val="20"/>
+                <w:lang w:eastAsia="zh-CN"/>
+              </w:rPr>
+              <w:t>文件夹</w:t>
+            </w:r>
+          </w:p>
+          <w:p>
+            <w:pPr>
+              <w:spacing w:after="60"/>
+              <w:rPr>
+                <w:b/>
+                <w:color w:val="0B2545"/>
+                <w:sz w:val="20"/>
+                <w:lang w:eastAsia="zh-CN"/>
+              </w:rPr>
+            </w:pPr>
+            <w:r>
+              <w:rPr>
+                <w:rFonts w:hint="eastAsia"/>
+                <w:b/>
+                <w:color w:val="0B2545"/>
+                <w:sz w:val="20"/>
+                <w:lang w:eastAsia="zh-CN"/>
+              </w:rPr>
+              <w:t>放产品应用案例图片。每张图必须能对应某个已填写的应用案例；只提交方图或横图，图片宽度必须大于或等于高度；竖图不要提交。</w:t>
             </w:r>
           </w:p>
         </w:tc>
@@ -3014,6 +3145,55 @@
           </w:p>
         </w:tc>
       </w:tr>
+      <w:tr>
+        <w:tc>
+          <w:tcPr>
+            <w:tcW w:w="9416" w:type="dxa"/>
+          </w:tcPr>
+          <w:p>
+            <w:pPr>
+              <w:spacing w:after="60"/>
+              <w:rPr>
+                <w:b/>
+                <w:color w:val="0B2545"/>
+                <w:sz w:val="20"/>
+                <w:lang w:eastAsia="zh-CN"/>
+              </w:rPr>
+            </w:pPr>
+            <w:r>
+              <w:rPr>
+                <w:rFonts w:hint="eastAsia"/>
+                <w:b/>
+                <w:color w:val="0B2545"/>
+                <w:sz w:val="20"/>
+                <w:lang w:eastAsia="zh-CN"/>
+              </w:rPr>
+              <w:t>产品应用图片清单（可选）</w:t>
+            </w:r>
+          </w:p>
+          <w:p>
+            <w:pPr>
+              <w:spacing w:after="60"/>
+              <w:rPr>
+                <w:b/>
+                <w:color w:val="0B2545"/>
+                <w:sz w:val="20"/>
+                <w:lang w:eastAsia="zh-CN"/>
+              </w:rPr>
+            </w:pPr>
+            <w:r>
+              <w:rPr>
+                <w:rFonts w:hint="eastAsia"/>
+                <w:b/>
+                <w:color w:val="0B2545"/>
+                <w:sz w:val="20"/>
+                <w:lang w:eastAsia="zh-CN"/>
+              </w:rPr>
+              <w:t>每行建议包含：产品名称、应用名称、图片主题、文件名、图片方向确认。图片必须为方图或横图。</w:t>
+            </w:r>
+          </w:p>
+        </w:tc>
+      </w:tr>
     </w:tbl>
     <w:p>
       <w:pPr>
@@ -3028,6 +3208,7 @@
         <w:pStyle w:val="1"/>
       </w:pPr>
       <w:r>
+        <w:lastRenderedPageBreak/>
         <w:t xml:space="preserve">6. </w:t>
       </w:r>
       <w:r>
@@ -3200,7 +3381,6 @@
                 <w:sz w:val="17"/>
                 <w:lang w:eastAsia="zh-CN"/>
               </w:rPr>
-              <w:lastRenderedPageBreak/>
               <w:t>确认所有产品级证书在提交资料当天仍然有效。</w:t>
             </w:r>
           </w:p>
@@ -3225,7 +3405,6 @@
                 <w:sz w:val="20"/>
                 <w:lang w:eastAsia="zh-CN"/>
               </w:rPr>
-              <w:lastRenderedPageBreak/>
               <w:t>产品文档归属确认</w:t>
             </w:r>
           </w:p>
@@ -3330,25 +3509,7 @@
                 <w:sz w:val="17"/>
                 <w:lang w:eastAsia="zh-CN"/>
               </w:rPr>
-              <w:t>，</w:t>
-            </w:r>
-            <w:proofErr w:type="gramStart"/>
-            <w:r>
-              <w:rPr>
-                <w:color w:val="555555"/>
-                <w:sz w:val="17"/>
-                <w:lang w:eastAsia="zh-CN"/>
-              </w:rPr>
-              <w:t>且单文件</w:t>
-            </w:r>
-            <w:proofErr w:type="gramEnd"/>
-            <w:r>
-              <w:rPr>
-                <w:color w:val="555555"/>
-                <w:sz w:val="17"/>
-                <w:lang w:eastAsia="zh-CN"/>
-              </w:rPr>
-              <w:t>小于</w:t>
+              <w:t>，且单文件小于</w:t>
             </w:r>
             <w:r>
               <w:rPr>
@@ -3476,7 +3637,6 @@
       <w:pStyle w:val="a7"/>
       <w:jc w:val="right"/>
       <w:rPr>
-        <w:rFonts w:hint="eastAsia"/>
         <w:lang w:eastAsia="zh-CN"/>
       </w:rPr>
     </w:pPr>

</xml_diff>